<commit_message>
Date Time bug fix.
</commit_message>
<xml_diff>
--- a/README.docx
+++ b/README.docx
@@ -1,6 +1,6 @@
 
 <file path=word/document.xml><?xml version="1.0" encoding="utf-8"?>
-<w:document xmlns:wpc="http://schemas.microsoft.com/office/word/2010/wordprocessingCanvas" xmlns:cx="http://schemas.microsoft.com/office/drawing/2014/chartex" xmlns:cx1="http://schemas.microsoft.com/office/drawing/2015/9/8/chartex" xmlns:cx2="http://schemas.microsoft.com/office/drawing/2015/10/21/chartex" xmlns:cx3="http://schemas.microsoft.com/office/drawing/2016/5/9/chartex" xmlns:cx4="http://schemas.microsoft.com/office/drawing/2016/5/10/chartex" xmlns:cx5="http://schemas.microsoft.com/office/drawing/2016/5/11/chartex" xmlns:cx6="http://schemas.microsoft.com/office/drawing/2016/5/12/chartex" xmlns:cx7="http://schemas.microsoft.com/office/drawing/2016/5/13/chartex" xmlns:cx8="http://schemas.microsoft.com/office/drawing/2016/5/14/chartex" xmlns:mc="http://schemas.openxmlformats.org/markup-compatibility/2006" xmlns:aink="http://schemas.microsoft.com/office/drawing/2016/ink" xmlns:am3d="http://schemas.microsoft.com/office/drawing/2017/model3d" xmlns:o="urn:schemas-microsoft-com:office:office" xmlns:oel="http://schemas.microsoft.com/office/2019/extlst" xmlns:r="http://schemas.openxmlformats.org/officeDocument/2006/relationships" xmlns:m="http://schemas.openxmlformats.org/officeDocument/2006/math" xmlns:v="urn:schemas-microsoft-com:vml" xmlns:wp14="http://schemas.microsoft.com/office/word/2010/wordprocessingDrawing" xmlns:wp="http://schemas.openxmlformats.org/drawingml/2006/wordprocessingDrawing" xmlns:w10="urn:schemas-microsoft-com:office:word" xmlns:w="http://schemas.openxmlformats.org/wordprocessingml/2006/main" xmlns:w14="http://schemas.microsoft.com/office/word/2010/wordml" xmlns:w15="http://schemas.microsoft.com/office/word/2012/wordml" xmlns:w16cex="http://schemas.microsoft.com/office/word/2018/wordml/cex" xmlns:w16cid="http://schemas.microsoft.com/office/word/2016/wordml/cid" xmlns:w16="http://schemas.microsoft.com/office/word/2018/wordml" xmlns:w16du="http://schemas.microsoft.com/office/word/2023/wordml/word16du" xmlns:w16sdtdh="http://schemas.microsoft.com/office/word/2020/wordml/sdtdatahash" xmlns:w16se="http://schemas.microsoft.com/office/word/2015/wordml/symex" xmlns:wpg="http://schemas.microsoft.com/office/word/2010/wordprocessingGroup" xmlns:wpi="http://schemas.microsoft.com/office/word/2010/wordprocessingInk" xmlns:wne="http://schemas.microsoft.com/office/word/2006/wordml" xmlns:wps="http://schemas.microsoft.com/office/word/2010/wordprocessingShape" mc:Ignorable="w14 w15 w16se w16cid w16 w16cex w16sdtdh w16du wp14">
+<w:document xmlns:wpc="http://schemas.microsoft.com/office/word/2010/wordprocessingCanvas" xmlns:cx="http://schemas.microsoft.com/office/drawing/2014/chartex" xmlns:cx1="http://schemas.microsoft.com/office/drawing/2015/9/8/chartex" xmlns:cx2="http://schemas.microsoft.com/office/drawing/2015/10/21/chartex" xmlns:cx3="http://schemas.microsoft.com/office/drawing/2016/5/9/chartex" xmlns:cx4="http://schemas.microsoft.com/office/drawing/2016/5/10/chartex" xmlns:cx5="http://schemas.microsoft.com/office/drawing/2016/5/11/chartex" xmlns:cx6="http://schemas.microsoft.com/office/drawing/2016/5/12/chartex" xmlns:cx7="http://schemas.microsoft.com/office/drawing/2016/5/13/chartex" xmlns:cx8="http://schemas.microsoft.com/office/drawing/2016/5/14/chartex" xmlns:mc="http://schemas.openxmlformats.org/markup-compatibility/2006" xmlns:aink="http://schemas.microsoft.com/office/drawing/2016/ink" xmlns:am3d="http://schemas.microsoft.com/office/drawing/2017/model3d" xmlns:o="urn:schemas-microsoft-com:office:office" xmlns:oel="http://schemas.microsoft.com/office/2019/extlst" xmlns:r="http://schemas.openxmlformats.org/officeDocument/2006/relationships" xmlns:m="http://schemas.openxmlformats.org/officeDocument/2006/math" xmlns:v="urn:schemas-microsoft-com:vml" xmlns:wp14="http://schemas.microsoft.com/office/word/2010/wordprocessingDrawing" xmlns:wp="http://schemas.openxmlformats.org/drawingml/2006/wordprocessingDrawing" xmlns:w10="urn:schemas-microsoft-com:office:word" xmlns:w="http://schemas.openxmlformats.org/wordprocessingml/2006/main" xmlns:w14="http://schemas.microsoft.com/office/word/2010/wordml" xmlns:w15="http://schemas.microsoft.com/office/word/2012/wordml" xmlns:w16cex="http://schemas.microsoft.com/office/word/2018/wordml/cex" xmlns:w16cid="http://schemas.microsoft.com/office/word/2016/wordml/cid" xmlns:w16="http://schemas.microsoft.com/office/word/2018/wordml" xmlns:w16du="http://schemas.microsoft.com/office/word/2023/wordml/word16du" xmlns:w16sdtdh="http://schemas.microsoft.com/office/word/2020/wordml/sdtdatahash" xmlns:w16sdtfl="http://schemas.microsoft.com/office/word/2024/wordml/sdtformatlock" xmlns:w16se="http://schemas.microsoft.com/office/word/2015/wordml/symex" xmlns:wpg="http://schemas.microsoft.com/office/word/2010/wordprocessingGroup" xmlns:wpi="http://schemas.microsoft.com/office/word/2010/wordprocessingInk" xmlns:wne="http://schemas.microsoft.com/office/word/2006/wordml" xmlns:wps="http://schemas.microsoft.com/office/word/2010/wordprocessingShape" mc:Ignorable="w14 w15 w16se w16cid w16 w16cex w16sdtdh w16sdtfl w16du wp14">
   <w:body>
     <w:p>
       <w:pPr>
@@ -83,7 +83,7 @@
           <w:lang w:val="tr-TR"/>
         </w:rPr>
         <w:drawing>
-          <wp:inline distT="0" distB="0" distL="0" distR="0" wp14:anchorId="59C160E8" wp14:editId="2882E986">
+          <wp:inline distT="0" distB="0" distL="0" distR="0" wp14:anchorId="59C160E8" wp14:editId="50978D8A">
             <wp:extent cx="4738255" cy="3195285"/>
             <wp:effectExtent l="0" t="0" r="5715" b="5715"/>
             <wp:docPr id="909171805" name="Picture 1"/>
@@ -261,28 +261,7 @@
         <w:rPr>
           <w:lang w:val="tr-TR"/>
         </w:rPr>
-        <w:t xml:space="preserve">DBContext was setup in </w:t>
-      </w:r>
-      <w:proofErr w:type="spellStart"/>
-      <w:r>
-        <w:rPr>
-          <w:lang w:val="tr-TR"/>
-        </w:rPr>
-        <w:t>the</w:t>
-      </w:r>
-      <w:proofErr w:type="spellEnd"/>
-      <w:r>
-        <w:rPr>
-          <w:lang w:val="tr-TR"/>
-        </w:rPr>
-        <w:t xml:space="preserve"> </w:t>
-      </w:r>
-      <w:proofErr w:type="spellStart"/>
-      <w:r>
-        <w:rPr>
-          <w:lang w:val="tr-TR"/>
-        </w:rPr>
-        <w:t>Persist</w:t>
+        <w:t>DBContext was setup in the Persist</w:t>
       </w:r>
       <w:r>
         <w:rPr>
@@ -294,106 +273,14 @@
         <w:rPr>
           <w:lang w:val="tr-TR"/>
         </w:rPr>
-        <w:t>nce</w:t>
-      </w:r>
-      <w:proofErr w:type="spellEnd"/>
-      <w:r>
-        <w:rPr>
-          <w:lang w:val="tr-TR"/>
-        </w:rPr>
-        <w:t xml:space="preserve"> </w:t>
-      </w:r>
-      <w:proofErr w:type="spellStart"/>
-      <w:r>
-        <w:rPr>
-          <w:lang w:val="tr-TR"/>
-        </w:rPr>
-        <w:t>layer</w:t>
-      </w:r>
-      <w:proofErr w:type="spellEnd"/>
-      <w:r>
-        <w:rPr>
-          <w:lang w:val="tr-TR"/>
-        </w:rPr>
-        <w:t>.</w:t>
-      </w:r>
-      <w:r>
-        <w:rPr>
-          <w:lang w:val="tr-TR"/>
-        </w:rPr>
-        <w:t xml:space="preserve"> </w:t>
-      </w:r>
-      <w:proofErr w:type="spellStart"/>
-      <w:r>
-        <w:rPr>
-          <w:lang w:val="tr-TR"/>
-        </w:rPr>
-        <w:t>So</w:t>
-      </w:r>
-      <w:proofErr w:type="spellEnd"/>
-      <w:r>
-        <w:rPr>
-          <w:lang w:val="tr-TR"/>
-        </w:rPr>
-        <w:t xml:space="preserve">, </w:t>
-      </w:r>
-      <w:proofErr w:type="spellStart"/>
-      <w:r>
-        <w:rPr>
-          <w:lang w:val="tr-TR"/>
-        </w:rPr>
-        <w:t>you</w:t>
-      </w:r>
-      <w:proofErr w:type="spellEnd"/>
-      <w:r>
-        <w:rPr>
-          <w:lang w:val="tr-TR"/>
-        </w:rPr>
-        <w:t xml:space="preserve"> </w:t>
-      </w:r>
-      <w:proofErr w:type="spellStart"/>
-      <w:r>
-        <w:rPr>
-          <w:lang w:val="tr-TR"/>
-        </w:rPr>
-        <w:t>need</w:t>
-      </w:r>
-      <w:proofErr w:type="spellEnd"/>
-      <w:r>
-        <w:rPr>
-          <w:lang w:val="tr-TR"/>
-        </w:rPr>
-        <w:t xml:space="preserve"> </w:t>
-      </w:r>
-      <w:proofErr w:type="spellStart"/>
-      <w:r>
-        <w:rPr>
-          <w:lang w:val="tr-TR"/>
-        </w:rPr>
-        <w:t>to</w:t>
-      </w:r>
-      <w:proofErr w:type="spellEnd"/>
-      <w:r>
-        <w:rPr>
-          <w:lang w:val="tr-TR"/>
-        </w:rPr>
-        <w:t xml:space="preserve"> set </w:t>
-      </w:r>
-      <w:proofErr w:type="spellStart"/>
-      <w:r>
-        <w:rPr>
-          <w:lang w:val="tr-TR"/>
-        </w:rPr>
-        <w:t>the</w:t>
-      </w:r>
-      <w:proofErr w:type="spellEnd"/>
-      <w:r>
-        <w:rPr>
-          <w:lang w:val="tr-TR"/>
-        </w:rPr>
-        <w:t xml:space="preserve"> Project as </w:t>
-      </w:r>
-      <w:proofErr w:type="spellStart"/>
+        <w:t>nce layer.</w:t>
+      </w:r>
+      <w:r>
+        <w:rPr>
+          <w:lang w:val="tr-TR"/>
+        </w:rPr>
+        <w:t xml:space="preserve"> So, you need to set the Project as </w:t>
+      </w:r>
       <w:r>
         <w:rPr>
           <w:b/>
@@ -402,68 +289,11 @@
         </w:rPr>
         <w:t>Persistence</w:t>
       </w:r>
-      <w:proofErr w:type="spellEnd"/>
-      <w:r>
-        <w:rPr>
-          <w:lang w:val="tr-TR"/>
-        </w:rPr>
-        <w:t xml:space="preserve"> in </w:t>
-      </w:r>
-      <w:proofErr w:type="spellStart"/>
-      <w:r>
-        <w:rPr>
-          <w:lang w:val="tr-TR"/>
-        </w:rPr>
-        <w:t>the</w:t>
-      </w:r>
-      <w:proofErr w:type="spellEnd"/>
-      <w:r>
-        <w:rPr>
-          <w:lang w:val="tr-TR"/>
-        </w:rPr>
-        <w:t xml:space="preserve"> </w:t>
-      </w:r>
-      <w:proofErr w:type="spellStart"/>
-      <w:r>
-        <w:rPr>
-          <w:lang w:val="tr-TR"/>
-        </w:rPr>
-        <w:t>package</w:t>
-      </w:r>
-      <w:proofErr w:type="spellEnd"/>
-      <w:r>
-        <w:rPr>
-          <w:lang w:val="tr-TR"/>
-        </w:rPr>
-        <w:t xml:space="preserve"> </w:t>
-      </w:r>
-      <w:proofErr w:type="spellStart"/>
-      <w:r>
-        <w:rPr>
-          <w:lang w:val="tr-TR"/>
-        </w:rPr>
-        <w:t>manager</w:t>
-      </w:r>
-      <w:proofErr w:type="spellEnd"/>
-      <w:r>
-        <w:rPr>
-          <w:lang w:val="tr-TR"/>
-        </w:rPr>
-        <w:t xml:space="preserve"> </w:t>
-      </w:r>
-      <w:proofErr w:type="spellStart"/>
-      <w:r>
-        <w:rPr>
-          <w:lang w:val="tr-TR"/>
-        </w:rPr>
-        <w:t>console</w:t>
-      </w:r>
-      <w:proofErr w:type="spellEnd"/>
-      <w:r>
-        <w:rPr>
-          <w:lang w:val="tr-TR"/>
-        </w:rPr>
-        <w:t>.</w:t>
+      <w:r>
+        <w:rPr>
+          <w:lang w:val="tr-TR"/>
+        </w:rPr>
+        <w:t xml:space="preserve"> in the package manager console.</w:t>
       </w:r>
     </w:p>
     <w:p>
@@ -508,8 +338,9 @@
         <w:pStyle w:val="ListParagraph"/>
         <w:numPr>
           <w:ilvl w:val="0"/>
-          <w:numId w:val="1"/>
+          <w:numId w:val="2"/>
         </w:numPr>
+        <w:spacing w:line="256" w:lineRule="auto"/>
         <w:rPr>
           <w:lang w:val="tr-TR"/>
         </w:rPr>
@@ -526,7 +357,7 @@
           <w:bCs/>
           <w:lang w:val="tr-TR"/>
         </w:rPr>
-        <w:t>-Context HrDatabaseContext</w:t>
+        <w:t>-Context ClefCraftDatabaseContext</w:t>
       </w:r>
     </w:p>
     <w:p>
@@ -534,8 +365,9 @@
         <w:pStyle w:val="ListParagraph"/>
         <w:numPr>
           <w:ilvl w:val="0"/>
-          <w:numId w:val="1"/>
+          <w:numId w:val="2"/>
         </w:numPr>
+        <w:spacing w:line="256" w:lineRule="auto"/>
         <w:rPr>
           <w:lang w:val="tr-TR"/>
         </w:rPr>
@@ -552,7 +384,7 @@
           <w:bCs/>
           <w:lang w:val="tr-TR"/>
         </w:rPr>
-        <w:t>-Context HrDatabaseContext</w:t>
+        <w:t>-Context ClefCraftDatabaseContext</w:t>
       </w:r>
     </w:p>
     <w:p>
@@ -735,7 +567,7 @@
           <w:lang w:val="tr-TR"/>
         </w:rPr>
         <w:drawing>
-          <wp:inline distT="0" distB="0" distL="0" distR="0" wp14:anchorId="6D3CCF78" wp14:editId="41139D36">
+          <wp:inline distT="0" distB="0" distL="0" distR="0" wp14:anchorId="6D3CCF78" wp14:editId="2136DBB6">
             <wp:extent cx="4397577" cy="1301732"/>
             <wp:effectExtent l="0" t="0" r="3175" b="0"/>
             <wp:docPr id="1083838405" name="Picture 3"/>
@@ -1065,7 +897,7 @@
 </file>
 
 <file path=word/numbering.xml><?xml version="1.0" encoding="utf-8"?>
-<w:numbering xmlns:wpc="http://schemas.microsoft.com/office/word/2010/wordprocessingCanvas" xmlns:cx="http://schemas.microsoft.com/office/drawing/2014/chartex" xmlns:cx1="http://schemas.microsoft.com/office/drawing/2015/9/8/chartex" xmlns:cx2="http://schemas.microsoft.com/office/drawing/2015/10/21/chartex" xmlns:cx3="http://schemas.microsoft.com/office/drawing/2016/5/9/chartex" xmlns:cx4="http://schemas.microsoft.com/office/drawing/2016/5/10/chartex" xmlns:cx5="http://schemas.microsoft.com/office/drawing/2016/5/11/chartex" xmlns:cx6="http://schemas.microsoft.com/office/drawing/2016/5/12/chartex" xmlns:cx7="http://schemas.microsoft.com/office/drawing/2016/5/13/chartex" xmlns:cx8="http://schemas.microsoft.com/office/drawing/2016/5/14/chartex" xmlns:mc="http://schemas.openxmlformats.org/markup-compatibility/2006" xmlns:aink="http://schemas.microsoft.com/office/drawing/2016/ink" xmlns:am3d="http://schemas.microsoft.com/office/drawing/2017/model3d" xmlns:o="urn:schemas-microsoft-com:office:office" xmlns:oel="http://schemas.microsoft.com/office/2019/extlst" xmlns:r="http://schemas.openxmlformats.org/officeDocument/2006/relationships" xmlns:m="http://schemas.openxmlformats.org/officeDocument/2006/math" xmlns:v="urn:schemas-microsoft-com:vml" xmlns:wp14="http://schemas.microsoft.com/office/word/2010/wordprocessingDrawing" xmlns:wp="http://schemas.openxmlformats.org/drawingml/2006/wordprocessingDrawing" xmlns:w10="urn:schemas-microsoft-com:office:word" xmlns:w="http://schemas.openxmlformats.org/wordprocessingml/2006/main" xmlns:w14="http://schemas.microsoft.com/office/word/2010/wordml" xmlns:w15="http://schemas.microsoft.com/office/word/2012/wordml" xmlns:w16cex="http://schemas.microsoft.com/office/word/2018/wordml/cex" xmlns:w16cid="http://schemas.microsoft.com/office/word/2016/wordml/cid" xmlns:w16="http://schemas.microsoft.com/office/word/2018/wordml" xmlns:w16du="http://schemas.microsoft.com/office/word/2023/wordml/word16du" xmlns:w16sdtdh="http://schemas.microsoft.com/office/word/2020/wordml/sdtdatahash" xmlns:w16se="http://schemas.microsoft.com/office/word/2015/wordml/symex" xmlns:wpg="http://schemas.microsoft.com/office/word/2010/wordprocessingGroup" xmlns:wpi="http://schemas.microsoft.com/office/word/2010/wordprocessingInk" xmlns:wne="http://schemas.microsoft.com/office/word/2006/wordml" xmlns:wps="http://schemas.microsoft.com/office/word/2010/wordprocessingShape" mc:Ignorable="w14 w15 w16se w16cid w16 w16cex w16sdtdh w16du wp14">
+<w:numbering xmlns:wpc="http://schemas.microsoft.com/office/word/2010/wordprocessingCanvas" xmlns:cx="http://schemas.microsoft.com/office/drawing/2014/chartex" xmlns:cx1="http://schemas.microsoft.com/office/drawing/2015/9/8/chartex" xmlns:cx2="http://schemas.microsoft.com/office/drawing/2015/10/21/chartex" xmlns:cx3="http://schemas.microsoft.com/office/drawing/2016/5/9/chartex" xmlns:cx4="http://schemas.microsoft.com/office/drawing/2016/5/10/chartex" xmlns:cx5="http://schemas.microsoft.com/office/drawing/2016/5/11/chartex" xmlns:cx6="http://schemas.microsoft.com/office/drawing/2016/5/12/chartex" xmlns:cx7="http://schemas.microsoft.com/office/drawing/2016/5/13/chartex" xmlns:cx8="http://schemas.microsoft.com/office/drawing/2016/5/14/chartex" xmlns:mc="http://schemas.openxmlformats.org/markup-compatibility/2006" xmlns:aink="http://schemas.microsoft.com/office/drawing/2016/ink" xmlns:am3d="http://schemas.microsoft.com/office/drawing/2017/model3d" xmlns:o="urn:schemas-microsoft-com:office:office" xmlns:oel="http://schemas.microsoft.com/office/2019/extlst" xmlns:r="http://schemas.openxmlformats.org/officeDocument/2006/relationships" xmlns:m="http://schemas.openxmlformats.org/officeDocument/2006/math" xmlns:v="urn:schemas-microsoft-com:vml" xmlns:wp14="http://schemas.microsoft.com/office/word/2010/wordprocessingDrawing" xmlns:wp="http://schemas.openxmlformats.org/drawingml/2006/wordprocessingDrawing" xmlns:w10="urn:schemas-microsoft-com:office:word" xmlns:w="http://schemas.openxmlformats.org/wordprocessingml/2006/main" xmlns:w14="http://schemas.microsoft.com/office/word/2010/wordml" xmlns:w15="http://schemas.microsoft.com/office/word/2012/wordml" xmlns:w16cex="http://schemas.microsoft.com/office/word/2018/wordml/cex" xmlns:w16cid="http://schemas.microsoft.com/office/word/2016/wordml/cid" xmlns:w16="http://schemas.microsoft.com/office/word/2018/wordml" xmlns:w16du="http://schemas.microsoft.com/office/word/2023/wordml/word16du" xmlns:w16sdtdh="http://schemas.microsoft.com/office/word/2020/wordml/sdtdatahash" xmlns:w16sdtfl="http://schemas.microsoft.com/office/word/2024/wordml/sdtformatlock" xmlns:w16se="http://schemas.microsoft.com/office/word/2015/wordml/symex" xmlns:wpg="http://schemas.microsoft.com/office/word/2010/wordprocessingGroup" xmlns:wpi="http://schemas.microsoft.com/office/word/2010/wordprocessingInk" xmlns:wne="http://schemas.microsoft.com/office/word/2006/wordml" xmlns:wps="http://schemas.microsoft.com/office/word/2010/wordprocessingShape" mc:Ignorable="w14 w15 w16se w16cid w16 w16cex w16sdtdh w16sdtfl w16du wp14">
   <w:abstractNum w:abstractNumId="0" w15:restartNumberingAfterBreak="0">
     <w:nsid w:val="698C7157"/>
     <w:multiLevelType w:val="hybridMultilevel"/>
@@ -1182,11 +1014,23 @@
   <w:num w:numId="1" w16cid:durableId="2020349014">
     <w:abstractNumId w:val="0"/>
   </w:num>
+  <w:num w:numId="2" w16cid:durableId="1481578194">
+    <w:abstractNumId w:val="0"/>
+    <w:lvlOverride w:ilvl="0"/>
+    <w:lvlOverride w:ilvl="1"/>
+    <w:lvlOverride w:ilvl="2"/>
+    <w:lvlOverride w:ilvl="3"/>
+    <w:lvlOverride w:ilvl="4"/>
+    <w:lvlOverride w:ilvl="5"/>
+    <w:lvlOverride w:ilvl="6"/>
+    <w:lvlOverride w:ilvl="7"/>
+    <w:lvlOverride w:ilvl="8"/>
+  </w:num>
 </w:numbering>
 </file>
 
 <file path=word/styles.xml><?xml version="1.0" encoding="utf-8"?>
-<w:styles xmlns:mc="http://schemas.openxmlformats.org/markup-compatibility/2006" xmlns:r="http://schemas.openxmlformats.org/officeDocument/2006/relationships" xmlns:w="http://schemas.openxmlformats.org/wordprocessingml/2006/main" xmlns:w14="http://schemas.microsoft.com/office/word/2010/wordml" xmlns:w15="http://schemas.microsoft.com/office/word/2012/wordml" xmlns:w16cex="http://schemas.microsoft.com/office/word/2018/wordml/cex" xmlns:w16cid="http://schemas.microsoft.com/office/word/2016/wordml/cid" xmlns:w16="http://schemas.microsoft.com/office/word/2018/wordml" xmlns:w16du="http://schemas.microsoft.com/office/word/2023/wordml/word16du" xmlns:w16sdtdh="http://schemas.microsoft.com/office/word/2020/wordml/sdtdatahash" xmlns:w16se="http://schemas.microsoft.com/office/word/2015/wordml/symex" mc:Ignorable="w14 w15 w16se w16cid w16 w16cex w16sdtdh w16du">
+<w:styles xmlns:mc="http://schemas.openxmlformats.org/markup-compatibility/2006" xmlns:r="http://schemas.openxmlformats.org/officeDocument/2006/relationships" xmlns:w="http://schemas.openxmlformats.org/wordprocessingml/2006/main" xmlns:w14="http://schemas.microsoft.com/office/word/2010/wordml" xmlns:w15="http://schemas.microsoft.com/office/word/2012/wordml" xmlns:w16cex="http://schemas.microsoft.com/office/word/2018/wordml/cex" xmlns:w16cid="http://schemas.microsoft.com/office/word/2016/wordml/cid" xmlns:w16="http://schemas.microsoft.com/office/word/2018/wordml" xmlns:w16du="http://schemas.microsoft.com/office/word/2023/wordml/word16du" xmlns:w16sdtdh="http://schemas.microsoft.com/office/word/2020/wordml/sdtdatahash" xmlns:w16sdtfl="http://schemas.microsoft.com/office/word/2024/wordml/sdtformatlock" xmlns:w16se="http://schemas.microsoft.com/office/word/2015/wordml/symex" mc:Ignorable="w14 w15 w16se w16cid w16 w16cex w16sdtdh w16sdtfl w16du">
   <w:docDefaults>
     <w:rPrDefault>
       <w:rPr>
@@ -1589,6 +1433,7 @@
   <w:style w:type="character" w:default="1" w:styleId="DefaultParagraphFont">
     <w:name w:val="Default Paragraph Font"/>
     <w:uiPriority w:val="1"/>
+    <w:semiHidden/>
     <w:unhideWhenUsed/>
   </w:style>
   <w:style w:type="table" w:default="1" w:styleId="TableNormal">

</xml_diff>

<commit_message>
Add tags functionality to item detail dialog.
</commit_message>
<xml_diff>
--- a/README.docx
+++ b/README.docx
@@ -83,7 +83,7 @@
           <w:lang w:val="tr-TR"/>
         </w:rPr>
         <w:drawing>
-          <wp:inline distT="0" distB="0" distL="0" distR="0" wp14:anchorId="59C160E8" wp14:editId="50978D8A">
+          <wp:inline distT="0" distB="0" distL="0" distR="0" wp14:anchorId="59C160E8" wp14:editId="4C40E6B1">
             <wp:extent cx="4738255" cy="3195285"/>
             <wp:effectExtent l="0" t="0" r="5715" b="5715"/>
             <wp:docPr id="909171805" name="Picture 1"/>
@@ -261,19 +261,37 @@
         <w:rPr>
           <w:lang w:val="tr-TR"/>
         </w:rPr>
-        <w:t>DBContext was setup in the Persist</w:t>
-      </w:r>
-      <w:r>
-        <w:rPr>
+        <w:t xml:space="preserve">DBContext was setup in the </w:t>
+      </w:r>
+      <w:r>
+        <w:rPr>
+          <w:b/>
+          <w:bCs/>
+          <w:lang w:val="tr-TR"/>
+        </w:rPr>
+        <w:t>Persist</w:t>
+      </w:r>
+      <w:r>
+        <w:rPr>
+          <w:b/>
+          <w:bCs/>
           <w:lang w:val="tr-TR"/>
         </w:rPr>
         <w:t>e</w:t>
       </w:r>
       <w:r>
         <w:rPr>
-          <w:lang w:val="tr-TR"/>
-        </w:rPr>
-        <w:t>nce layer.</w:t>
+          <w:b/>
+          <w:bCs/>
+          <w:lang w:val="tr-TR"/>
+        </w:rPr>
+        <w:t>nce layer</w:t>
+      </w:r>
+      <w:r>
+        <w:rPr>
+          <w:lang w:val="tr-TR"/>
+        </w:rPr>
+        <w:t>.</w:t>
       </w:r>
       <w:r>
         <w:rPr>
@@ -389,136 +407,24 @@
     </w:p>
     <w:p>
       <w:pPr>
-        <w:rPr>
-          <w:lang w:val="tr-TR"/>
-        </w:rPr>
-      </w:pPr>
-      <w:r>
-        <w:rPr>
-          <w:lang w:val="tr-TR"/>
-        </w:rPr>
-        <w:t>Or i</w:t>
-      </w:r>
-      <w:r>
-        <w:rPr>
-          <w:lang w:val="tr-TR"/>
-        </w:rPr>
-        <w:t xml:space="preserve">f you add anything </w:t>
-      </w:r>
-      <w:r>
-        <w:rPr>
-          <w:lang w:val="tr-TR"/>
-        </w:rPr>
-        <w:t xml:space="preserve">that may affect the database, for example you added something to </w:t>
-      </w:r>
-      <w:r>
-        <w:rPr>
-          <w:lang w:val="tr-TR"/>
-        </w:rPr>
-        <w:t>the Domain part, you should update your database.</w:t>
-      </w:r>
-      <w:r>
-        <w:rPr>
-          <w:lang w:val="tr-TR"/>
-        </w:rPr>
-        <w:t xml:space="preserve"> To do that, apply the same commands above.</w:t>
-      </w:r>
-      <w:r>
-        <w:rPr>
-          <w:lang w:val="tr-TR"/>
-        </w:rPr>
-        <w:t xml:space="preserve"> I have added new properties to the following file:</w:t>
-      </w:r>
-    </w:p>
-    <w:p>
-      <w:pPr>
-        <w:rPr>
-          <w:lang w:val="tr-TR"/>
-        </w:rPr>
-      </w:pPr>
-      <w:r>
-        <w:rPr>
-          <w:noProof/>
-          <w:lang w:val="tr-TR"/>
-        </w:rPr>
-        <w:drawing>
-          <wp:inline distT="0" distB="0" distL="0" distR="0" wp14:anchorId="7AE339D6" wp14:editId="112C5C41">
-            <wp:extent cx="3250642" cy="1833349"/>
-            <wp:effectExtent l="0" t="0" r="6985" b="0"/>
-            <wp:docPr id="486833094" name="Picture 1"/>
-            <wp:cNvGraphicFramePr>
-              <a:graphicFrameLocks xmlns:a="http://schemas.openxmlformats.org/drawingml/2006/main" noChangeAspect="1"/>
-            </wp:cNvGraphicFramePr>
-            <a:graphic xmlns:a="http://schemas.openxmlformats.org/drawingml/2006/main">
-              <a:graphicData uri="http://schemas.openxmlformats.org/drawingml/2006/picture">
-                <pic:pic xmlns:pic="http://schemas.openxmlformats.org/drawingml/2006/picture">
-                  <pic:nvPicPr>
-                    <pic:cNvPr id="486833094" name=""/>
-                    <pic:cNvPicPr/>
-                  </pic:nvPicPr>
-                  <pic:blipFill>
-                    <a:blip r:embed="rId7"/>
-                    <a:stretch>
-                      <a:fillRect/>
-                    </a:stretch>
-                  </pic:blipFill>
-                  <pic:spPr>
-                    <a:xfrm>
-                      <a:off x="0" y="0"/>
-                      <a:ext cx="3259190" cy="1838170"/>
-                    </a:xfrm>
-                    <a:prstGeom prst="rect">
-                      <a:avLst/>
-                    </a:prstGeom>
-                  </pic:spPr>
-                </pic:pic>
-              </a:graphicData>
-            </a:graphic>
-          </wp:inline>
-        </w:drawing>
-      </w:r>
-    </w:p>
-    <w:p>
-      <w:pPr>
-        <w:rPr>
-          <w:lang w:val="tr-TR"/>
-        </w:rPr>
-      </w:pPr>
-      <w:r>
-        <w:rPr>
-          <w:lang w:val="tr-TR"/>
-        </w:rPr>
-        <w:t xml:space="preserve">So go to “Package Manager Console” on the bottom of the page and run </w:t>
-      </w:r>
-      <w:r>
-        <w:rPr>
-          <w:lang w:val="tr-TR"/>
-        </w:rPr>
-        <w:t>these</w:t>
-      </w:r>
-      <w:r>
-        <w:rPr>
-          <w:lang w:val="tr-TR"/>
-        </w:rPr>
-        <w:t xml:space="preserve"> command</w:t>
-      </w:r>
-      <w:r>
-        <w:rPr>
-          <w:lang w:val="tr-TR"/>
-        </w:rPr>
-        <w:t>s</w:t>
-      </w:r>
-      <w:r>
-        <w:rPr>
-          <w:lang w:val="tr-TR"/>
-        </w:rPr>
-        <w:t>. Note that the default project should be the project where our db context is located.</w:t>
-      </w:r>
-      <w:r>
-        <w:rPr>
-          <w:lang w:val="tr-TR"/>
-        </w:rPr>
-        <w:t xml:space="preserve"> In the Picture below, we added “</w:t>
+        <w:pStyle w:val="ListParagraph"/>
+        <w:spacing w:line="256" w:lineRule="auto"/>
+        <w:rPr>
+          <w:lang w:val="tr-TR"/>
+        </w:rPr>
+      </w:pPr>
+    </w:p>
+    <w:p>
+      <w:pPr>
+        <w:rPr>
+          <w:lang w:val="tr-TR"/>
+        </w:rPr>
+      </w:pPr>
+      <w:r>
+        <w:rPr>
+          <w:lang w:val="tr-TR"/>
+        </w:rPr>
+        <w:t>So go to “Package Manager Console” on the bottom of the page and run these commands. Note that the default project should be the project where our db context is located. In the Picture below, we added “</w:t>
       </w:r>
       <w:r>
         <w:rPr>
@@ -540,19 +446,7 @@
         <w:rPr>
           <w:lang w:val="tr-TR"/>
         </w:rPr>
-        <w:t xml:space="preserve">” since we have more than one db context. Otherwise, you can omit </w:t>
-      </w:r>
-      <w:r>
-        <w:rPr>
-          <w:lang w:val="tr-TR"/>
-        </w:rPr>
-        <w:t>it</w:t>
-      </w:r>
-      <w:r>
-        <w:rPr>
-          <w:lang w:val="tr-TR"/>
-        </w:rPr>
-        <w:t>.</w:t>
+        <w:t>” since we have more than one db context. Otherwise, you can omit it.</w:t>
       </w:r>
     </w:p>
     <w:p>
@@ -567,7 +461,7 @@
           <w:lang w:val="tr-TR"/>
         </w:rPr>
         <w:drawing>
-          <wp:inline distT="0" distB="0" distL="0" distR="0" wp14:anchorId="6D3CCF78" wp14:editId="2136DBB6">
+          <wp:inline distT="0" distB="0" distL="0" distR="0" wp14:anchorId="3969D0FA" wp14:editId="2B82CF34">
             <wp:extent cx="4397577" cy="1301732"/>
             <wp:effectExtent l="0" t="0" r="3175" b="0"/>
             <wp:docPr id="1083838405" name="Picture 3"/>
@@ -584,7 +478,7 @@
                     </pic:cNvPicPr>
                   </pic:nvPicPr>
                   <pic:blipFill>
-                    <a:blip r:embed="rId8" cstate="print">
+                    <a:blip r:embed="rId7" cstate="print">
                       <a:extLst>
                         <a:ext uri="{28A0092B-C50C-407E-A947-70E740481C1C}">
                           <a14:useLocalDpi xmlns:a14="http://schemas.microsoft.com/office/drawing/2010/main" val="0"/>
@@ -624,6 +518,103 @@
       </w:pPr>
       <w:r>
         <w:rPr>
+          <w:lang w:val="tr-TR"/>
+        </w:rPr>
+        <w:t>Also,</w:t>
+      </w:r>
+      <w:r>
+        <w:rPr>
+          <w:lang w:val="tr-TR"/>
+        </w:rPr>
+        <w:t xml:space="preserve"> i</w:t>
+      </w:r>
+      <w:r>
+        <w:rPr>
+          <w:lang w:val="tr-TR"/>
+        </w:rPr>
+        <w:t xml:space="preserve">f you add anything </w:t>
+      </w:r>
+      <w:r>
+        <w:rPr>
+          <w:lang w:val="tr-TR"/>
+        </w:rPr>
+        <w:t xml:space="preserve">that may affect the database, for example you added something to </w:t>
+      </w:r>
+      <w:r>
+        <w:rPr>
+          <w:lang w:val="tr-TR"/>
+        </w:rPr>
+        <w:t>the Domain part, you should update your database.</w:t>
+      </w:r>
+      <w:r>
+        <w:rPr>
+          <w:lang w:val="tr-TR"/>
+        </w:rPr>
+        <w:t xml:space="preserve"> To do that, apply the same commands above.</w:t>
+      </w:r>
+      <w:r>
+        <w:rPr>
+          <w:lang w:val="tr-TR"/>
+        </w:rPr>
+        <w:t xml:space="preserve"> I have added new properties to the following file:</w:t>
+      </w:r>
+    </w:p>
+    <w:p>
+      <w:pPr>
+        <w:rPr>
+          <w:lang w:val="tr-TR"/>
+        </w:rPr>
+      </w:pPr>
+      <w:r>
+        <w:rPr>
+          <w:noProof/>
+          <w:lang w:val="tr-TR"/>
+        </w:rPr>
+        <w:drawing>
+          <wp:inline distT="0" distB="0" distL="0" distR="0" wp14:anchorId="7AE339D6" wp14:editId="5D5F9273">
+            <wp:extent cx="3060123" cy="1725897"/>
+            <wp:effectExtent l="0" t="0" r="6985" b="8255"/>
+            <wp:docPr id="486833094" name="Picture 1"/>
+            <wp:cNvGraphicFramePr>
+              <a:graphicFrameLocks xmlns:a="http://schemas.openxmlformats.org/drawingml/2006/main" noChangeAspect="1"/>
+            </wp:cNvGraphicFramePr>
+            <a:graphic xmlns:a="http://schemas.openxmlformats.org/drawingml/2006/main">
+              <a:graphicData uri="http://schemas.openxmlformats.org/drawingml/2006/picture">
+                <pic:pic xmlns:pic="http://schemas.openxmlformats.org/drawingml/2006/picture">
+                  <pic:nvPicPr>
+                    <pic:cNvPr id="486833094" name=""/>
+                    <pic:cNvPicPr/>
+                  </pic:nvPicPr>
+                  <pic:blipFill>
+                    <a:blip r:embed="rId8"/>
+                    <a:stretch>
+                      <a:fillRect/>
+                    </a:stretch>
+                  </pic:blipFill>
+                  <pic:spPr>
+                    <a:xfrm>
+                      <a:off x="0" y="0"/>
+                      <a:ext cx="3094662" cy="1745377"/>
+                    </a:xfrm>
+                    <a:prstGeom prst="rect">
+                      <a:avLst/>
+                    </a:prstGeom>
+                  </pic:spPr>
+                </pic:pic>
+              </a:graphicData>
+            </a:graphic>
+          </wp:inline>
+        </w:drawing>
+      </w:r>
+    </w:p>
+    <w:p>
+      <w:pPr>
+        <w:rPr>
+          <w:lang w:val="tr-TR"/>
+        </w:rPr>
+      </w:pPr>
+      <w:r>
+        <w:rPr>
           <w:b/>
           <w:bCs/>
           <w:lang w:val="tr-TR"/>
@@ -666,7 +657,13 @@
         <w:rPr>
           <w:lang w:val="tr-TR"/>
         </w:rPr>
-        <w:t>HrLeaveManagementIdentityDbContext</w:t>
+        <w:t>ClefCraft</w:t>
+      </w:r>
+      <w:r>
+        <w:rPr>
+          <w:lang w:val="tr-TR"/>
+        </w:rPr>
+        <w:t>IdentityDbContext</w:t>
       </w:r>
       <w:r>
         <w:rPr>
@@ -686,11 +683,10 @@
           <w:noProof/>
           <w:lang w:val="tr-TR"/>
         </w:rPr>
-        <w:lastRenderedPageBreak/>
         <w:drawing>
-          <wp:inline distT="0" distB="0" distL="0" distR="0" wp14:anchorId="4D3540FE" wp14:editId="65629E50">
-            <wp:extent cx="4411226" cy="1654680"/>
-            <wp:effectExtent l="0" t="0" r="0" b="3175"/>
+          <wp:inline distT="0" distB="0" distL="0" distR="0" wp14:anchorId="4D3540FE" wp14:editId="6C597DCA">
+            <wp:extent cx="3725811" cy="1397577"/>
+            <wp:effectExtent l="0" t="0" r="0" b="0"/>
             <wp:docPr id="2095050663" name="Picture 1"/>
             <wp:cNvGraphicFramePr>
               <a:graphicFrameLocks xmlns:a="http://schemas.openxmlformats.org/drawingml/2006/main" noChangeAspect="1"/>
@@ -711,7 +707,7 @@
                   <pic:spPr>
                     <a:xfrm>
                       <a:off x="0" y="0"/>
-                      <a:ext cx="4529671" cy="1699110"/>
+                      <a:ext cx="3842669" cy="1441411"/>
                     </a:xfrm>
                     <a:prstGeom prst="rect">
                       <a:avLst/>
@@ -734,6 +730,7 @@
         <w:rPr>
           <w:lang w:val="tr-TR"/>
         </w:rPr>
+        <w:lastRenderedPageBreak/>
         <w:t>In addition to that, your startup project top of the page should be the Api Project.</w:t>
       </w:r>
     </w:p>
@@ -1016,15 +1013,6 @@
   </w:num>
   <w:num w:numId="2" w16cid:durableId="1481578194">
     <w:abstractNumId w:val="0"/>
-    <w:lvlOverride w:ilvl="0"/>
-    <w:lvlOverride w:ilvl="1"/>
-    <w:lvlOverride w:ilvl="2"/>
-    <w:lvlOverride w:ilvl="3"/>
-    <w:lvlOverride w:ilvl="4"/>
-    <w:lvlOverride w:ilvl="5"/>
-    <w:lvlOverride w:ilvl="6"/>
-    <w:lvlOverride w:ilvl="7"/>
-    <w:lvlOverride w:ilvl="8"/>
   </w:num>
 </w:numbering>
 </file>

</xml_diff>

<commit_message>
bug fix: board item relation type
</commit_message>
<xml_diff>
--- a/README.docx
+++ b/README.docx
@@ -83,7 +83,7 @@
           <w:lang w:val="tr-TR"/>
         </w:rPr>
         <w:drawing>
-          <wp:inline distT="0" distB="0" distL="0" distR="0" wp14:anchorId="59C160E8" wp14:editId="4C40E6B1">
+          <wp:inline distT="0" distB="0" distL="0" distR="0" wp14:anchorId="59C160E8" wp14:editId="0B6DC7CD">
             <wp:extent cx="4738255" cy="3195285"/>
             <wp:effectExtent l="0" t="0" r="5715" b="5715"/>
             <wp:docPr id="909171805" name="Picture 1"/>
@@ -407,39 +407,84 @@
     </w:p>
     <w:p>
       <w:pPr>
-        <w:pStyle w:val="ListParagraph"/>
         <w:spacing w:line="256" w:lineRule="auto"/>
-        <w:rPr>
-          <w:lang w:val="tr-TR"/>
-        </w:rPr>
-      </w:pPr>
-    </w:p>
-    <w:p>
-      <w:pPr>
-        <w:rPr>
-          <w:lang w:val="tr-TR"/>
-        </w:rPr>
-      </w:pPr>
-      <w:r>
-        <w:rPr>
-          <w:lang w:val="tr-TR"/>
-        </w:rPr>
-        <w:t>So go to “Package Manager Console” on the bottom of the page and run these commands. Note that the default project should be the project where our db context is located. In the Picture below, we added “</w:t>
-      </w:r>
-      <w:r>
         <w:rPr>
           <w:b/>
           <w:bCs/>
           <w:lang w:val="tr-TR"/>
         </w:rPr>
-        <w:t>-Context</w:t>
-      </w:r>
+      </w:pPr>
       <w:r>
         <w:rPr>
           <w:b/>
           <w:bCs/>
           <w:lang w:val="tr-TR"/>
         </w:rPr>
+        <w:t>For Postgre:</w:t>
+      </w:r>
+    </w:p>
+    <w:p>
+      <w:pPr>
+        <w:spacing w:line="256" w:lineRule="auto"/>
+        <w:rPr>
+          <w:lang w:val="tr-TR"/>
+        </w:rPr>
+      </w:pPr>
+      <w:r>
+        <w:rPr>
+          <w:lang w:val="tr-TR"/>
+        </w:rPr>
+        <w:t>dotnet ef migrations add AddBoardItemRelations --project ClefCraft.Persistence --startup-project ClefCraft.Api --context ClefCraftDatabaseContext</w:t>
+      </w:r>
+    </w:p>
+    <w:p>
+      <w:pPr>
+        <w:spacing w:line="256" w:lineRule="auto"/>
+        <w:rPr>
+          <w:lang w:val="tr-TR"/>
+        </w:rPr>
+      </w:pPr>
+      <w:r>
+        <w:rPr>
+          <w:lang w:val="tr-TR"/>
+        </w:rPr>
+        <w:t>dotnet ef database update --project ClefCraft.Persistence --startup-project ClefCraft.Api --context ClefCraftDatabaseContext</w:t>
+      </w:r>
+    </w:p>
+    <w:p>
+      <w:pPr>
+        <w:spacing w:line="256" w:lineRule="auto"/>
+        <w:rPr>
+          <w:lang w:val="tr-TR"/>
+        </w:rPr>
+      </w:pPr>
+    </w:p>
+    <w:p>
+      <w:pPr>
+        <w:rPr>
+          <w:lang w:val="tr-TR"/>
+        </w:rPr>
+      </w:pPr>
+      <w:r>
+        <w:rPr>
+          <w:lang w:val="tr-TR"/>
+        </w:rPr>
+        <w:t>So go to “Package Manager Console” on the bottom of the page and run these commands. Note that the default project should be the project where our db context is located. In the Picture below, we added “</w:t>
+      </w:r>
+      <w:r>
+        <w:rPr>
+          <w:b/>
+          <w:bCs/>
+          <w:lang w:val="tr-TR"/>
+        </w:rPr>
+        <w:t>-Context</w:t>
+      </w:r>
+      <w:r>
+        <w:rPr>
+          <w:b/>
+          <w:bCs/>
+          <w:lang w:val="tr-TR"/>
+        </w:rPr>
         <w:t xml:space="preserve"> dbContextName</w:t>
       </w:r>
       <w:r>
@@ -461,7 +506,7 @@
           <w:lang w:val="tr-TR"/>
         </w:rPr>
         <w:drawing>
-          <wp:inline distT="0" distB="0" distL="0" distR="0" wp14:anchorId="3969D0FA" wp14:editId="2B82CF34">
+          <wp:inline distT="0" distB="0" distL="0" distR="0" wp14:anchorId="3969D0FA" wp14:editId="10C5B2EC">
             <wp:extent cx="4397577" cy="1301732"/>
             <wp:effectExtent l="0" t="0" r="3175" b="0"/>
             <wp:docPr id="1083838405" name="Picture 3"/>
@@ -683,6 +728,7 @@
           <w:noProof/>
           <w:lang w:val="tr-TR"/>
         </w:rPr>
+        <w:lastRenderedPageBreak/>
         <w:drawing>
           <wp:inline distT="0" distB="0" distL="0" distR="0" wp14:anchorId="4D3540FE" wp14:editId="6C597DCA">
             <wp:extent cx="3725811" cy="1397577"/>
@@ -730,7 +776,6 @@
         <w:rPr>
           <w:lang w:val="tr-TR"/>
         </w:rPr>
-        <w:lastRenderedPageBreak/>
         <w:t>In addition to that, your startup project top of the page should be the Api Project.</w:t>
       </w:r>
     </w:p>

</xml_diff>